<commit_message>
Add TJC LCDM development interface
</commit_message>
<xml_diff>
--- a/docs/lcdm_development_interface.docx
+++ b/docs/lcdm_development_interface.docx
@@ -647,7 +647,7 @@
           <w:p>
             <w:pPr/>
             <w:r>
-              <w:t xml:space="preserve">推荐</w:t>
+              <w:t xml:space="preserve">已选 TJC</w:t>
             </w:r>
           </w:p>
         </w:tc>
@@ -680,7 +680,7 @@
           <w:p>
             <w:pPr/>
             <w:r>
-              <w:t xml:space="preserve">单价通常高于国产 DGUS 类</w:t>
+              <w:t xml:space="preserve">需严格统一控件命名和三字节结束符</w:t>
             </w:r>
           </w:p>
         </w:tc>
@@ -803,7 +803,7 @@
     <w:p>
       <w:pPr/>
       <w:r>
-        <w:t xml:space="preserve">建议先采购或评估：2.4 寸或 2.8 寸、320x240、UART TTL、带触摸、可 5V 供电且串口电平兼容 3.3V 的智能屏。屏幕工程中预先做页面和控件，PY32 只维护变量表。</w:t>
+        <w:t xml:space="preserve">当前已按 TJC 陶晶驰串口屏方向接入固件骨架。建议规格仍为：2.4 寸或 2.8 寸、320x240、UART TTL、带触摸、可 5V 供电且串口电平兼容 3.3V。屏幕工程中预先做页面和控件，PY32 只维护变量表。TJC 具体控件命名和 MCU 指令见 docs/tjc_lcdm_integration.md。</w:t>
       </w:r>
     </w:p>
     <w:p>
@@ -2633,6 +2633,41 @@
             <w:pPr/>
             <w:r>
               <w:t xml:space="preserve">只在 SERVO_ENABLE_LCDM_UART 打开时编译</w:t>
+            </w:r>
+          </w:p>
+        </w:tc>
+      </w:tr>
+      <w:tr>
+        <w:tc>
+          <w:tcPr>
+            <w:tcW w:w="2400" w:type="dxa"/>
+          </w:tcPr>
+          <w:p>
+            <w:pPr/>
+            <w:r>
+              <w:t xml:space="preserve">tjc_lcdm.c/.h</w:t>
+            </w:r>
+          </w:p>
+        </w:tc>
+        <w:tc>
+          <w:tcPr>
+            <w:tcW w:w="2400" w:type="dxa"/>
+          </w:tcPr>
+          <w:p>
+            <w:pPr/>
+            <w:r>
+              <w:t xml:space="preserve">TJC 陶晶驰串口屏适配层</w:t>
+            </w:r>
+          </w:p>
+        </w:tc>
+        <w:tc>
+          <w:tcPr>
+            <w:tcW w:w="2400" w:type="dxa"/>
+          </w:tcPr>
+          <w:p>
+            <w:pPr/>
+            <w:r>
+              <w:t xml:space="preserve">只在 SERVO_ENABLE_TJC_LCDM=1 打开时启用</w:t>
             </w:r>
           </w:p>
         </w:tc>

</xml_diff>